<commit_message>
Fill author information in title page and cover letter
Co-Authored-By: Claude Sonnet 5.5 <noreply@anthropic.com>
Claude-Session: https://claude.ai/code/session_01Ac6H42VjpVF4dJt1z1jQbD
</commit_message>
<xml_diff>
--- a/dss_revision/submission/1_title_page.docx
+++ b/dss_revision/submission/1_title_page.docx
@@ -37,24 +37,11 @@
       </w:r>
     </w:p>
     <w:p>
-      <w:r/>
       <w:r>
-        <w:rPr>
-          <w:highlight w:val="yellow"/>
-        </w:rPr>
-        <w:t>[Author 1 name, department, institution, city, country]</w:t>
+        <w:t>Ook Lee</w:t>
+        <w:br/>
+        <w:t>Department of Information Systems, Hanyang University, Seoul, Korea</w:t>
       </w:r>
-      <w:r/>
-    </w:p>
-    <w:p>
-      <w:r/>
-      <w:r>
-        <w:rPr>
-          <w:highlight w:val="yellow"/>
-        </w:rPr>
-        <w:t>[Author 2 name, department, institution, city, country (if any)]</w:t>
-      </w:r>
-      <w:r/>
     </w:p>
     <w:p>
       <w:pPr>
@@ -65,12 +52,14 @@
       </w:r>
     </w:p>
     <w:p>
-      <w:r/>
+      <w:r>
+        <w:t xml:space="preserve">Ook Lee, Department of Information Systems, Hanyang University, Seoul, Korea. E-mail: ooklee@hanyang.ac.kr. </w:t>
+      </w:r>
       <w:r>
         <w:rPr>
           <w:highlight w:val="yellow"/>
         </w:rPr>
-        <w:t>[Name, postal address, e-mail, telephone, ORCID]</w:t>
+        <w:t>[Postal address, telephone, ORCID]</w:t>
       </w:r>
       <w:r/>
     </w:p>
@@ -83,12 +72,14 @@
       </w:r>
     </w:p>
     <w:p>
-      <w:r/>
+      <w:r>
+        <w:t xml:space="preserve">Ook Lee: </w:t>
+      </w:r>
       <w:r>
         <w:rPr>
           <w:highlight w:val="yellow"/>
         </w:rPr>
-        <w:t>[Author 1: Conceptualization, Methodology, Software, Formal analysis, Writing – original draft. Edit to match the actual contributions.]</w:t>
+        <w:t>[Conceptualization, Methodology, Software, Formal analysis, Writing – original draft, Writing – review and editing. Edit to match the actual contributions.]</w:t>
       </w:r>
       <w:r/>
     </w:p>

</xml_diff>